<commit_message>
added tool and component list link to maker guide
</commit_message>
<xml_diff>
--- a/Toy_Instructions/Bubble/Fubbles_Light_Up_Mini_Bubble_Machine/Fubbles_Light_Up_Mini_Bubble_Machine_Maker_Guide.docx
+++ b/Toy_Instructions/Bubble/Fubbles_Light_Up_Mini_Bubble_Machine/Fubbles_Light_Up_Mini_Bubble_Machine_Maker_Guide.docx
@@ -252,6 +252,23 @@
               <w:t>3 AA Batteries</w:t>
             </w:r>
           </w:p>
+          <w:p/>
+          <w:p>
+            <w:r>
+              <w:t xml:space="preserve">Refer to the </w:t>
+            </w:r>
+            <w:hyperlink r:id="rId13" w:history="1">
+              <w:r>
+                <w:rPr>
+                  <w:rStyle w:val="Hyperlink"/>
+                </w:rPr>
+                <w:t>Tool and Component List</w:t>
+              </w:r>
+            </w:hyperlink>
+            <w:r>
+              <w:t xml:space="preserve"> for purchasing details.</w:t>
+            </w:r>
+          </w:p>
         </w:tc>
       </w:tr>
       <w:tr>
@@ -301,7 +318,7 @@
                           <pic:cNvPicPr/>
                         </pic:nvPicPr>
                         <pic:blipFill rotWithShape="1">
-                          <a:blip r:embed="rId13">
+                          <a:blip r:embed="rId14">
                             <a:extLst>
                               <a:ext uri="{28A0092B-C50C-407E-A947-70E740481C1C}">
                                 <a14:useLocalDpi xmlns:a14="http://schemas.microsoft.com/office/drawing/2010/main" val="0"/>
@@ -387,7 +404,7 @@
                           </pic:cNvPicPr>
                         </pic:nvPicPr>
                         <pic:blipFill rotWithShape="1">
-                          <a:blip r:embed="rId14" cstate="print">
+                          <a:blip r:embed="rId15" cstate="print">
                             <a:extLst>
                               <a:ext uri="{28A0092B-C50C-407E-A947-70E740481C1C}">
                                 <a14:useLocalDpi xmlns:a14="http://schemas.microsoft.com/office/drawing/2010/main" val="0"/>
@@ -457,7 +474,7 @@
                           </pic:cNvPicPr>
                         </pic:nvPicPr>
                         <pic:blipFill rotWithShape="1">
-                          <a:blip r:embed="rId14" cstate="print">
+                          <a:blip r:embed="rId15" cstate="print">
                             <a:extLst>
                               <a:ext uri="{28A0092B-C50C-407E-A947-70E740481C1C}">
                                 <a14:useLocalDpi xmlns:a14="http://schemas.microsoft.com/office/drawing/2010/main" val="0"/>
@@ -527,7 +544,7 @@
                           </pic:cNvPicPr>
                         </pic:nvPicPr>
                         <pic:blipFill rotWithShape="1">
-                          <a:blip r:embed="rId14" cstate="print">
+                          <a:blip r:embed="rId15" cstate="print">
                             <a:extLst>
                               <a:ext uri="{28A0092B-C50C-407E-A947-70E740481C1C}">
                                 <a14:useLocalDpi xmlns:a14="http://schemas.microsoft.com/office/drawing/2010/main" val="0"/>
@@ -785,7 +802,7 @@
                 <w:noProof/>
               </w:rPr>
               <w:drawing>
-                <wp:anchor distT="0" distB="0" distL="114300" distR="114300" simplePos="0" relativeHeight="251688964" behindDoc="0" locked="0" layoutInCell="1" allowOverlap="1" wp14:anchorId="326DB322" wp14:editId="01166C14">
+                <wp:anchor distT="0" distB="0" distL="114300" distR="114300" simplePos="0" relativeHeight="251688964" behindDoc="0" locked="0" layoutInCell="1" allowOverlap="1" wp14:anchorId="326DB322" wp14:editId="77C8D7B7">
                   <wp:simplePos x="0" y="0"/>
                   <wp:positionH relativeFrom="column">
                     <wp:posOffset>560070</wp:posOffset>
@@ -810,7 +827,7 @@
                           </pic:cNvPicPr>
                         </pic:nvPicPr>
                         <pic:blipFill rotWithShape="1">
-                          <a:blip r:embed="rId15" cstate="print">
+                          <a:blip r:embed="rId16" cstate="print">
                             <a:extLst>
                               <a:ext uri="{28A0092B-C50C-407E-A947-70E740481C1C}">
                                 <a14:useLocalDpi xmlns:a14="http://schemas.microsoft.com/office/drawing/2010/main" val="0"/>
@@ -922,7 +939,7 @@
                           </pic:cNvPicPr>
                         </pic:nvPicPr>
                         <pic:blipFill rotWithShape="1">
-                          <a:blip r:embed="rId16" cstate="print">
+                          <a:blip r:embed="rId17" cstate="print">
                             <a:extLst>
                               <a:ext uri="{28A0092B-C50C-407E-A947-70E740481C1C}">
                                 <a14:useLocalDpi xmlns:a14="http://schemas.microsoft.com/office/drawing/2010/main" val="0"/>
@@ -1124,7 +1141,7 @@
                           </pic:cNvPicPr>
                         </pic:nvPicPr>
                         <pic:blipFill rotWithShape="1">
-                          <a:blip r:embed="rId17" cstate="print">
+                          <a:blip r:embed="rId18" cstate="print">
                             <a:extLst>
                               <a:ext uri="{28A0092B-C50C-407E-A947-70E740481C1C}">
                                 <a14:useLocalDpi xmlns:a14="http://schemas.microsoft.com/office/drawing/2010/main" val="0"/>
@@ -1395,7 +1412,7 @@
                           <pic:cNvPicPr/>
                         </pic:nvPicPr>
                         <pic:blipFill>
-                          <a:blip r:embed="rId18">
+                          <a:blip r:embed="rId19">
                             <a:extLst>
                               <a:ext uri="{28A0092B-C50C-407E-A947-70E740481C1C}">
                                 <a14:useLocalDpi xmlns:a14="http://schemas.microsoft.com/office/drawing/2010/main" val="0"/>
@@ -1579,7 +1596,7 @@
                           <pic:cNvPicPr/>
                         </pic:nvPicPr>
                         <pic:blipFill>
-                          <a:blip r:embed="rId19">
+                          <a:blip r:embed="rId20">
                             <a:extLst>
                               <a:ext uri="{28A0092B-C50C-407E-A947-70E740481C1C}">
                                 <a14:useLocalDpi xmlns:a14="http://schemas.microsoft.com/office/drawing/2010/main" val="0"/>
@@ -1680,7 +1697,7 @@
                           <pic:cNvPicPr/>
                         </pic:nvPicPr>
                         <pic:blipFill rotWithShape="1">
-                          <a:blip r:embed="rId20" cstate="print">
+                          <a:blip r:embed="rId21" cstate="print">
                             <a:extLst>
                               <a:ext uri="{28A0092B-C50C-407E-A947-70E740481C1C}">
                                 <a14:useLocalDpi xmlns:a14="http://schemas.microsoft.com/office/drawing/2010/main" val="0"/>
@@ -1946,7 +1963,7 @@
                           <pic:cNvPicPr/>
                         </pic:nvPicPr>
                         <pic:blipFill>
-                          <a:blip r:embed="rId21">
+                          <a:blip r:embed="rId22">
                             <a:extLst>
                               <a:ext uri="{28A0092B-C50C-407E-A947-70E740481C1C}">
                                 <a14:useLocalDpi xmlns:a14="http://schemas.microsoft.com/office/drawing/2010/main" val="0"/>
@@ -2111,7 +2128,7 @@
                           </pic:cNvPicPr>
                         </pic:nvPicPr>
                         <pic:blipFill rotWithShape="1">
-                          <a:blip r:embed="rId22" cstate="print">
+                          <a:blip r:embed="rId23" cstate="print">
                             <a:extLst>
                               <a:ext uri="{28A0092B-C50C-407E-A947-70E740481C1C}">
                                 <a14:useLocalDpi xmlns:a14="http://schemas.microsoft.com/office/drawing/2010/main" val="0"/>
@@ -2318,7 +2335,7 @@
                           </pic:cNvPicPr>
                         </pic:nvPicPr>
                         <pic:blipFill rotWithShape="1">
-                          <a:blip r:embed="rId23" cstate="print">
+                          <a:blip r:embed="rId24" cstate="print">
                             <a:extLst>
                               <a:ext uri="{28A0092B-C50C-407E-A947-70E740481C1C}">
                                 <a14:useLocalDpi xmlns:a14="http://schemas.microsoft.com/office/drawing/2010/main" val="0"/>
@@ -2439,7 +2456,7 @@
                           </pic:cNvPicPr>
                         </pic:nvPicPr>
                         <pic:blipFill rotWithShape="1">
-                          <a:blip r:embed="rId24" cstate="print">
+                          <a:blip r:embed="rId25" cstate="print">
                             <a:extLst>
                               <a:ext uri="{28A0092B-C50C-407E-A947-70E740481C1C}">
                                 <a14:useLocalDpi xmlns:a14="http://schemas.microsoft.com/office/drawing/2010/main" val="0"/>
@@ -2654,7 +2671,7 @@
                           </pic:cNvPicPr>
                         </pic:nvPicPr>
                         <pic:blipFill rotWithShape="1">
-                          <a:blip r:embed="rId25" cstate="print">
+                          <a:blip r:embed="rId26" cstate="print">
                             <a:extLst>
                               <a:ext uri="{28A0092B-C50C-407E-A947-70E740481C1C}">
                                 <a14:useLocalDpi xmlns:a14="http://schemas.microsoft.com/office/drawing/2010/main" val="0"/>
@@ -2701,8 +2718,8 @@
       </w:pPr>
     </w:p>
     <w:sectPr>
-      <w:headerReference w:type="default" r:id="rId26"/>
-      <w:footerReference w:type="default" r:id="rId27"/>
+      <w:headerReference w:type="default" r:id="rId27"/>
+      <w:footerReference w:type="default" r:id="rId28"/>
       <w:pgSz w:w="12240" w:h="15840"/>
       <w:pgMar w:top="1440" w:right="1440" w:bottom="1440" w:left="1440" w:header="720" w:footer="708" w:gutter="0"/>
       <w:cols w:space="708"/>
@@ -6054,14 +6071,7 @@
 </file>
 
 <file path=customXml/item1.xml><?xml version="1.0" encoding="utf-8"?>
-<p:properties xmlns:p="http://schemas.microsoft.com/office/2006/metadata/properties" xmlns:xsi="http://www.w3.org/2001/XMLSchema-instance" xmlns:pc="http://schemas.microsoft.com/office/infopath/2007/PartnerControls">
-  <documentManagement>
-    <TaxCatchAll xmlns="38b325e6-602c-452a-8617-173bf47082c5" xsi:nil="true"/>
-    <lcf76f155ced4ddcb4097134ff3c332f xmlns="8cf100d1-0775-4feb-8634-62999c4541bc">
-      <Terms xmlns="http://schemas.microsoft.com/office/infopath/2007/PartnerControls"/>
-    </lcf76f155ced4ddcb4097134ff3c332f>
-  </documentManagement>
-</p:properties>
+<b:Sources xmlns:b="http://schemas.openxmlformats.org/officeDocument/2006/bibliography" xmlns="http://schemas.openxmlformats.org/officeDocument/2006/bibliography" SelectedStyle="\APASixthEditionOfficeOnline.xsl" StyleName="APA" Version="6"/>
 </file>
 
 <file path=customXml/item2.xml><?xml version="1.0" encoding="utf-8"?>
@@ -6074,7 +6084,14 @@
 </file>
 
 <file path=customXml/item3.xml><?xml version="1.0" encoding="utf-8"?>
-<b:Sources xmlns:b="http://schemas.openxmlformats.org/officeDocument/2006/bibliography" xmlns="http://schemas.openxmlformats.org/officeDocument/2006/bibliography" SelectedStyle="\APASixthEditionOfficeOnline.xsl" StyleName="APA" Version="6"/>
+<p:properties xmlns:p="http://schemas.microsoft.com/office/2006/metadata/properties" xmlns:xsi="http://www.w3.org/2001/XMLSchema-instance" xmlns:pc="http://schemas.microsoft.com/office/infopath/2007/PartnerControls">
+  <documentManagement>
+    <TaxCatchAll xmlns="38b325e6-602c-452a-8617-173bf47082c5" xsi:nil="true"/>
+    <lcf76f155ced4ddcb4097134ff3c332f xmlns="8cf100d1-0775-4feb-8634-62999c4541bc">
+      <Terms xmlns="http://schemas.microsoft.com/office/infopath/2007/PartnerControls"/>
+    </lcf76f155ced4ddcb4097134ff3c332f>
+  </documentManagement>
+</p:properties>
 </file>
 
 <file path=customXml/item4.xml><?xml version="1.0" encoding="utf-8"?>
@@ -6333,18 +6350,9 @@
 </file>
 
 <file path=customXml/itemProps1.xml><?xml version="1.0" encoding="utf-8"?>
-<ds:datastoreItem xmlns:ds="http://schemas.openxmlformats.org/officeDocument/2006/customXml" ds:itemID="{3A085C18-819E-4466-9494-DD461C39C2B0}">
+<ds:datastoreItem xmlns:ds="http://schemas.openxmlformats.org/officeDocument/2006/customXml" ds:itemID="{C438ADBA-56D5-474C-BF2C-97C24DDF66BD}">
   <ds:schemaRefs>
-    <ds:schemaRef ds:uri="http://purl.org/dc/dcmitype/"/>
-    <ds:schemaRef ds:uri="http://schemas.microsoft.com/office/2006/documentManagement/types"/>
-    <ds:schemaRef ds:uri="http://schemas.openxmlformats.org/package/2006/metadata/core-properties"/>
-    <ds:schemaRef ds:uri="http://schemas.microsoft.com/office/2006/metadata/properties"/>
-    <ds:schemaRef ds:uri="38b325e6-602c-452a-8617-173bf47082c5"/>
-    <ds:schemaRef ds:uri="http://purl.org/dc/terms/"/>
-    <ds:schemaRef ds:uri="http://schemas.microsoft.com/office/infopath/2007/PartnerControls"/>
-    <ds:schemaRef ds:uri="8cf100d1-0775-4feb-8634-62999c4541bc"/>
-    <ds:schemaRef ds:uri="http://www.w3.org/XML/1998/namespace"/>
-    <ds:schemaRef ds:uri="http://purl.org/dc/elements/1.1/"/>
+    <ds:schemaRef ds:uri="http://schemas.openxmlformats.org/officeDocument/2006/bibliography"/>
   </ds:schemaRefs>
 </ds:datastoreItem>
 </file>
@@ -6358,9 +6366,18 @@
 </file>
 
 <file path=customXml/itemProps3.xml><?xml version="1.0" encoding="utf-8"?>
-<ds:datastoreItem xmlns:ds="http://schemas.openxmlformats.org/officeDocument/2006/customXml" ds:itemID="{C438ADBA-56D5-474C-BF2C-97C24DDF66BD}">
+<ds:datastoreItem xmlns:ds="http://schemas.openxmlformats.org/officeDocument/2006/customXml" ds:itemID="{3A085C18-819E-4466-9494-DD461C39C2B0}">
   <ds:schemaRefs>
-    <ds:schemaRef ds:uri="http://schemas.openxmlformats.org/officeDocument/2006/bibliography"/>
+    <ds:schemaRef ds:uri="38b325e6-602c-452a-8617-173bf47082c5"/>
+    <ds:schemaRef ds:uri="http://purl.org/dc/elements/1.1/"/>
+    <ds:schemaRef ds:uri="http://schemas.microsoft.com/office/2006/documentManagement/types"/>
+    <ds:schemaRef ds:uri="8cf100d1-0775-4feb-8634-62999c4541bc"/>
+    <ds:schemaRef ds:uri="http://www.w3.org/XML/1998/namespace"/>
+    <ds:schemaRef ds:uri="http://schemas.openxmlformats.org/package/2006/metadata/core-properties"/>
+    <ds:schemaRef ds:uri="http://schemas.microsoft.com/office/infopath/2007/PartnerControls"/>
+    <ds:schemaRef ds:uri="http://schemas.microsoft.com/office/2006/metadata/properties"/>
+    <ds:schemaRef ds:uri="http://purl.org/dc/dcmitype/"/>
+    <ds:schemaRef ds:uri="http://purl.org/dc/terms/"/>
   </ds:schemaRefs>
 </ds:datastoreItem>
 </file>

</xml_diff>